<commit_message>
Add Hero imports and milestone-one assisted serve review
Preserve manual Hero exports and immutable revisions in a separate evidence archive. Add source-scoped serve review, synthetic receiver-frame checks, and milestone v0.6 documentation while keeping unvalidated geometry and outcomes out of local loss statistics and key eligibility.

Co-authored-by: Copilot <223556219+Copilot@users.noreply.github.com>
</commit_message>
<xml_diff>
--- a/docs/Eleven_Analyst_Spin_Guide_Developer_Brief.docx
+++ b/docs/Eleven_Analyst_Spin_Guide_Developer_Brief.docx
@@ -12,7 +12,7 @@
     </w:p>
     <w:p>
       <w:r>
-        <w:t>Developer handoff  |  Version 0.4  |  October 24 2026</w:t>
+        <w:t>Developer handoff  |  Version 0.6  |  October 25 2026</w:t>
       </w:r>
     </w:p>
     <w:p>
@@ -25,10 +25,7 @@
         <w:rPr>
           <w:b/>
         </w:rPr>
-        <w:t xml:space="preserve">Implementation checkpoint - 24 October 2026, version 0.3. The synthetic spin glossary and a conservative opponent-serve/first-return denominator are now implemented. The player confirmed explicit overhead-clockwise/counterclockwise naming, the documented receiver frame and right-handed play. The broader pilot does not replace the original long-sidespin/backhand gate. Actual in-game calibration and independent category validation remain pending. See section 14.</w:t>
-      </w:r>
-      <w:r>
-        <w:t xml:space="preserve"/>
+        <w:t>Implementation checkpoint - 25 October 2026, version 0.6. The glossary, catalogue, broad first-return evidence, generic key-delivery workflow and separate Hero importer are implemented. A source-revision-scoped assisted serve review and synthetic receiver-frame geometry tests now support milestone one. Real long/backhand placement and spin validation remain pending: no replay/video is available and provider coordinate axes, event timing and bounce reconstruction are unvalidated. Category attempts/errors and representative-feed fidelity remain unknown. See section 17; sections 12-16 retain earlier dated checkpoints.</w:t>
       </w:r>
     </w:p>
     <w:p>
@@ -2585,7 +2582,7 @@
         <w:rPr>
           <w:b/>
         </w:rPr>
-        <w:t xml:space="preserve">Status as of 24 October 2026: PARTIAL - not complete. The illustrative interactive glossary and conservative broad first-return denominator now exist, with math and outcome tests. Key 54334.340 was previously confirmed usable by the player. Validated long/sidespin/backhand labels, log-frame conversion and representative-shot fidelity remain open. The explicitly agreed broader opponent-serve pilot does not close this milestone.</w:t>
+        <w:t xml:space="preserve">Status as of 25 October 2026: PARTIAL - not complete; evidence acquisition and inspection have advanced. One real Hero match export (181 records: 138 Hits and 43 Tosses; 41 fields; 43 provider point groups) is preserved in a separate revisioned archive and dashboard view. Provider shot/spin labels and candidate machine fields are now available for calibration. They do not yet prove long sidespin serves to the backhand, first-return error rates or faithful reproduction. The existing glossary, catalogue, broad local receiving pilot and previously usable key 54334.340 remain foundations. The original completion gate below is unchanged.</w:t>
       </w:r>
       <w:r>
         <w:t xml:space="preserve"/>
@@ -3028,7 +3025,7 @@
     </w:p>
     <w:p>
       <w:r>
-        <w:t xml:space="preserve">Current next gate: player-assisted review of the implemented glossary, source examples and a representative serve feed. The synthetic conventions and broader pilot scope are agreed. Continue with independent category review and actual in-game observations; the original milestone-one category and physical-fidelity requirements remain open.</w:t>
+        <w:t>Current next gate: validate receiver-frame coordinates, provider event timing/spin units and bounce reconstruction against an independent reference. The imported sample has 21 opponent serve Hits, all carrying Mid direction/distance labels; those labels do not establish long/backhand membership. Use the assisted review to retain exact-source notes without inventing outcomes. Then classify actual category attempts/errors and validate one representative feed against agreed in-game tolerances. Cross-source reconciliation is required only before combining sources. Manual imports remain sufficient; automated collection is optional. See section 17.</w:t>
       </w:r>
     </w:p>
     <w:p>
@@ -3041,7 +3038,7 @@
     </w:p>
     <w:p>
       <w:r>
-        <w:t xml:space="preserve">Review the proposed right-handed frame, preset signs and clockwise/counterclockwise naming in sections 4-7 with a knowledgeable player. Choose a 3D rendering approach compatible with the current vanilla JavaScript, self-contained dashboard; there is no existing 3D engine or frontend framework to assume. Keep dependencies local rather than adding a runtime CDN. Record conventions and test fixtures before connecting any measured data.</w:t>
+        <w:t xml:space="preserve">Implemented foundation: the player confirmed the right-handed synthetic receiver frame, preset signs and explicit clockwise/counterclockwise naming. A dependency-free 3D Canvas renderer is in place. The remaining contract work is mapping and validating Hero/log units, reference axes and event timing into that frame; a provider's Left/Right spin labels must not silently replace the agreed viewer convention.</w:t>
       </w:r>
     </w:p>
     <w:p>
@@ -3054,7 +3051,7 @@
     </w:p>
     <w:p>
       <w:r>
-        <w:t xml:space="preserve">Implement the marked sphere, pure and mixed spin, independent controls, camera presets, pause/reset/slow motion and accessible static alternatives against synthetic inputs. Start paused. Meet the existing direction, camera-invariance, frame-rate-independence, zero/missing-data and responsive acceptance tests. Synthetic rad/s and m/s values must never be presented as converted log measurements without a validated mapping.</w:t>
+        <w:t xml:space="preserve">Implemented foundation: the marked sphere, pure/mixed spin, independent controls, camera presets, paused initial state, slow motion and accessible static alternatives are available with automated math tests and browser checks. Continue player review. Synthetic rad/s and m/s values remain separate from provider/log values until a validated conversion is established.</w:t>
       </w:r>
     </w:p>
     <w:p>
@@ -3067,7 +3064,7 @@
     </w:p>
     <w:p>
       <w:r>
-        <w:t xml:space="preserve">Review a small labeled serve sample covering successful and failed first returns. Establish log-to-viewer coordinates and units, handedness/receiver positioning, and observed-versus-derived length and spin rules. Count all classifiable receiving opportunities, not only point-ending losses; distinguish a failed first return from a later rally loss. Retain source references, classifier version and unknown/gap states. If long sidespin to backhand is not supportable, record the blocker and explicitly agree any pilot-category change rather than silently relabeling the data.</w:t>
+        <w:t xml:space="preserve">New evidence acquired: the manual Hero importer and independent evidence view provide a real sample with both players, provider labels/flags, numeric fields, source provenance and rejected-row diagnostics. Next reconcile the declared match summary with provider point groups, establish units and receiving-side geometry, and review a labeled sample covering successful and failed first returns. A toss is not a receiving attempt; a provider success flag is not an eventual point winner. Show category-specific attempts/errors only after these gates are met, with unknowns and classifier version retained. Do not silently relabel the original long-sidespin/backhand requirement.</w:t>
       </w:r>
     </w:p>
     <w:p>
@@ -3358,6 +3355,395 @@
     <w:p>
       <w:r>
         <w:t>The player has accepted the separate 20-feed broad repeatability test for existing key 54334.340, feed ANLY01, but has not supplied results. That generic delivery baseline does not validate the featured long-sidespin/backhand category. Milestone one remains PARTIAL until a category representative and the original evidence/fidelity gates are met.</w:t>
+      </w:r>
+    </w:p>
+    <w:p>
+      <w:pPr>
+        <w:pStyle w:val="Heading1"/>
+      </w:pPr>
+      <w:r>
+        <w:t>16 Hero and Clubhouse findings: progress toward milestone one</w:t>
+      </w:r>
+    </w:p>
+    <w:p>
+      <w:pPr>
+        <w:pStyle w:val="Heading2"/>
+      </w:pPr>
+      <w:r>
+        <w:t>Checkpoint: 25 October 2026. Milestone one remains PARTIAL.</w:t>
+      </w:r>
+    </w:p>
+    <w:p>
+      <w:r>
+        <w:t>Objective unchanged: explain an evidence-supported difficulty with long sidespin serves toward the player's backhand, provide clear counter-play and a usable key/profile, and validate a representative feed's spin, speed, placement and length. The new import work supplies inspectable evidence and potential reconstruction parameters; it does not by itself close the classification or in-game fidelity gates.</w:t>
+      </w:r>
+    </w:p>
+    <w:p>
+      <w:pPr>
+        <w:pStyle w:val="Heading2"/>
+      </w:pPr>
+      <w:r>
+        <w:t>16.1 What has actually been collected and implemented</w:t>
+      </w:r>
+    </w:p>
+    <w:p>
+      <w:r>
+        <w:t>One real reference export imported: provider match 01a1610f-89ac-7000-aa7a-1e42566bd38b, associated by the supplied handoff with Munna62 (770249) versus DigitalByooki (1909208). Source: https://11hero.com/matches/01a1610f-89ac-7000-aa7a-1e42566bd38b . The export lacks a match envelope; this association and the card metadata remain declarations rather than independently verified file contents.</w:t>
+      </w:r>
+    </w:p>
+    <w:p>
+      <w:r>
+        <w:t>Observed file contents: 181 accepted records, all 41 original fields retained, 138 Hits, 43 Tosses and 43 distinct provider point IDs. Both players are preserved: 92 target-player records and 89 opponent records, including tosses. These record counts are not receiving-attempt counts. There were no rejected or duplicate rows in this sample. The original retrieval time is unknown; the archive records import time separately.</w:t>
+      </w:r>
+    </w:p>
+    <w:p>
+      <w:r>
+        <w:t>Manual import pipeline implemented in hero_import.py: explicit manifest, provider-ID namespacing, timezone-aware timestamp validation with original text/precision retained, finite-number/boolean checks, nullable and unknown fields, diagnostics, and quarantine of conflicting duplicate IDs. Raw bytes and normalized evidence are stored transactionally in a separate Hero SQLite archive. Identical reimport reuses the existing revision; changed content or declared metadata retains a new revision without overwriting old evidence.</w:t>
+      </w:r>
+    </w:p>
+    <w:p>
+      <w:r>
+        <w:t>Independent Hero dashboard view implemented: choose a source/revision; filter Hits, Tosses and either player; inspect provider fields, flags, point groups, provenance and declared metadata; review diagnostics; and export evidence. Live and offline views work. Local loss rankings, receiving denominators, named catalogue diagnoses and machine-key eligibility are not populated from Hero flags.</w:t>
+      </w:r>
+    </w:p>
+    <w:p>
+      <w:r>
+        <w:t>Persistence and privacy verified: the source export and private manifest stay local and ignored by Git. All 1,721 local snapshots, the existing profile/database, practice settings and cloud publication journal were preserved. Local-log rebuilds retain the Hero archive and display it separately. No match collection requests or cloud uploads were made during this implementation.</w:t>
+      </w:r>
+    </w:p>
+    <w:p>
+      <w:pPr>
+        <w:pStyle w:val="Heading2"/>
+      </w:pPr>
+      <w:r>
+        <w:t>16.2 Newly available evidence and its limits</w:t>
+      </w:r>
+    </w:p>
+    <w:p>
+      <w:r>
+        <w:t>Provider classifications already exist. Observed shot labels include Toss, Serve, Drive, Push, Chop, SlowLoop and FastLoop; spin labels include None, BottomLeft, BottomRight, Bottom, TopLeft, TopRight, Top, Left and Right. They are retained as provider-derived labels, not discarded or automatically mapped to the Analyst lexicon. In particular, Hero Left/Right must be checked against the agreed overhead-clockwise/counterclockwise convention.</w:t>
+      </w:r>
+    </w:p>
+    <w:p>
+      <w:r>
+        <w:t>Placement is not established by label availability. In the research sample, direction was Mid for all 181 records; distance was Mid for 175 and Long for 6; height was null throughout. Event position is not a receiving bounce or paddle pose. These distributions do not establish accurate long-serve or backhand-side classification.</w:t>
+      </w:r>
+    </w:p>
+    <w:p>
+      <w:r>
+        <w:t>Units remain a hypothesis to test. For one reported serve, the norm of rrate=(-5313.3, 7701.6, -5056.5) divided by 360 is approximately 29.54, close to rrateSqrt=29.5. This suggests degrees/s components and revolutions/s magnitude, but is not a verified contract. No conversion was applied. Velocity units, reference frame, measurement timing and spin signs also require independent checks.</w:t>
+      </w:r>
+    </w:p>
+    <w:p>
+      <w:r>
+        <w:t>Provider outcome/sequence flags are not local reasons. isServe can be true on Toss as well as Hit rows. isSuccess, isWinningShot, isServeSuccess and rallyCount are preserved annotations whose definitions need validation. The download has no explicit table/net collisions, paired incoming/outgoing states, continuous trajectory or validated terminal outcomes. No engine ticks, local log lines, collision events or raw_reason strings were invented.</w:t>
+      </w:r>
+    </w:p>
+    <w:p>
+      <w:r>
+        <w:t>Potential reconstruction inputs are now available: bmPos*, bmBasePos*, bmSpeed, launch angles and bmSpin* fields. Their semantics, transformations and game-settings compatibility remain unverified. Raw rrate values must not be substituted for machine spin sliders. These fields do not yet create publishable or physically faithful category feeds.</w:t>
+      </w:r>
+    </w:p>
+    <w:p>
+      <w:pPr>
+        <w:pStyle w:val="Heading2"/>
+      </w:pPr>
+      <w:r>
+        <w:t>16.3 Reconciliation and research findings</w:t>
+      </w:r>
+    </w:p>
+    <w:p>
+      <w:r>
+        <w:t>The handoff's match card showed 2:0 with set scores 13:11 and 0:0, while the export contains 43 provider point groups. The importer retains that discrepancy as unresolved metadata. Do not declare a complete match or derive point winners from that summary. The download lacks match ID, ranked status, names, set/score and pointWonByHome fields found in the browser UI; independently obtained context must remain separate.</w:t>
+      </w:r>
+    </w:p>
+    <w:p>
+      <w:r>
+        <w:t>Coverage discovery is not collection. The dated Hero research found 55 unique match links across five pages (12/12/12/12/7), not 55 downloaded or imported matches. This delivery imported one reference match export. Hero data reflects uploaded coverage, not complete Eleven account history. Direct research HTTP requests received 403, while browser export worked; no supported bulk match API was identified, and no access restriction is bypassed.</w:t>
+      </w:r>
+    </w:p>
+    <w:p>
+      <w:r>
+        <w:t>Clubhouse findings are not shot evidence. Inspected live responses included scores, serving indicators, commentary and replay references but no ball vectors. Repeated requests for the same commentary ID/time/score yielded different tactical descriptions. Treat that commentary as unverified generated narrative, not proof of a serve family or weakness. Replay metadata alone does not establish a telemetry download.</w:t>
+      </w:r>
+    </w:p>
+    <w:p>
+      <w:r>
+        <w:t>The community scoreboard references Eleven account/match-summary APIs and an API-key requirement, but current authentication and response schemas were not verified. Existing HeroClient endpoints support ball-machine storage, not discovered match-history or shot-download operations. Do not conflate the two integrations.</w:t>
+      </w:r>
+    </w:p>
+    <w:p>
+      <w:pPr>
+        <w:pStyle w:val="Heading2"/>
+      </w:pPr>
+      <w:r>
+        <w:t>16.4 Milestone-one acceptance mapping</w:t>
+      </w:r>
+    </w:p>
+    <w:p>
+      <w:pPr>
+        <w:pStyle w:val="ListBullet"/>
+      </w:pPr>
+      <w:r>
+        <w:t>ACHIEVED FOUNDATION - Category explanation and visuals: the long-sidespin/backhand definition, conditional counter-play guidance, success criteria, illustrative glossary and table graphics exist. This is not yet a personalized, validated finding.</w:t>
+      </w:r>
+    </w:p>
+    <w:p>
+      <w:pPr>
+        <w:pStyle w:val="ListBullet"/>
+      </w:pPr>
+      <w:r>
+        <w:t>ACHIEVED FOUNDATION - Evidence acquisition and inspection: one real Hero export, original provider fields, immutable revisions and source-specific inspection are operational. The existing broad local first-return pilot is also available.</w:t>
+      </w:r>
+    </w:p>
+    <w:p>
+      <w:pPr>
+        <w:pStyle w:val="ListBullet"/>
+      </w:pPr>
+      <w:r>
+        <w:t>OPEN / BLOCKING - Category membership and difficulty: establish which incoming serve Hits genuinely satisfy long, sidespin and backhand-side criteria; review positive/negative examples; then show supported receiving attempts, immediate-return failures, matches/opponents and uncertainty. Neither 138 Hits nor 43 point groups is that denominator.</w:t>
+      </w:r>
+    </w:p>
+    <w:p>
+      <w:pPr>
+        <w:pStyle w:val="ListBullet"/>
+      </w:pPr>
+      <w:r>
+        <w:t>OPEN / BLOCKING - Reliable reference outcomes: resolve enough source context to support the selected category's immediate-return evidence. Cross-source reconciliation is CONDITIONAL, not required if one source is sufficient: Hero UUIDs are not local game IDs, so any future merge needs an explicit crosswalk supported by participants, time and scores. Until then, keep datasets separate to prevent double counting.</w:t>
+      </w:r>
+    </w:p>
+    <w:p>
+      <w:pPr>
+        <w:pStyle w:val="ListBullet"/>
+      </w:pPr>
+      <w:r>
+        <w:t>PARTIAL - Practice delivery: generic return plans, sanitized publishing and exact read-back verification work. Key 54334.340 was previously reported usable; it is not a validated long-sidespin/backhand representative and is not evidence of an opponent clone.</w:t>
+      </w:r>
+    </w:p>
+    <w:p>
+      <w:pPr>
+        <w:pStyle w:val="ListBullet"/>
+      </w:pPr>
+      <w:r>
+        <w:t>OPEN / BLOCKING - Representative feed and player walkthrough: validate one selected category example against agreed spin, speed, legal-bounce, placement and length tolerances; record the settings revision and actual observations; then demonstrate understanding, loading and practice of the intended shot.</w:t>
+      </w:r>
+    </w:p>
+    <w:p>
+      <w:pPr>
+        <w:pStyle w:val="ListBullet"/>
+      </w:pPr>
+      <w:r>
+        <w:t>OPTIONAL ENABLER - Resumable collection: manual JSON imports are sufficient under the original milestone-one gate. A future collector can increase coverage, but is not implemented and is not required before validating the initial category.</w:t>
+      </w:r>
+    </w:p>
+    <w:p>
+      <w:pPr>
+        <w:pStyle w:val="Heading2"/>
+      </w:pPr>
+      <w:r>
+        <w:t>16.5 Immediate next steps, in dependency order</w:t>
+      </w:r>
+    </w:p>
+    <w:p>
+      <w:pPr>
+        <w:pStyle w:val="ListBullet"/>
+      </w:pPr>
+      <w:r>
+        <w:t>1. Reconcile the reference match envelope and point/outcome context using independently captured source metadata. Keep any unresolved discrepancies visible rather than repairing them by assumption.</w:t>
+      </w:r>
+    </w:p>
+    <w:p>
+      <w:pPr>
+        <w:pStyle w:val="ListBullet"/>
+      </w:pPr>
+      <w:r>
+        <w:t>2. Calibrate provider numeric units, reference axes, event timing and spin-label signs. Establish receiving-bounce/length inference and handedness-aware placement criteria; the imported data may not contain enough geometry for every label.</w:t>
+      </w:r>
+    </w:p>
+    <w:p>
+      <w:pPr>
+        <w:pStyle w:val="ListBullet"/>
+      </w:pPr>
+      <w:r>
+        <w:t>3. Review a labeled sample of incoming serve Hits and immediate returns, including counterexamples and unknowns. Map supported labels to shot-lexicon-1 without treating tosses as attempts or a later rally loss as a failed first return.</w:t>
+      </w:r>
+    </w:p>
+    <w:p>
+      <w:pPr>
+        <w:pStyle w:val="ListBullet"/>
+      </w:pPr>
+      <w:r>
+        <w:t>4. Produce category-specific attempts/errors and repeated-match evidence. If the reference sample cannot support the original category, state the insufficiency and obtain more suitable evidence rather than substituting the broad pilot.</w:t>
+      </w:r>
+    </w:p>
+    <w:p>
+      <w:pPr>
+        <w:pStyle w:val="ListBullet"/>
+      </w:pPr>
+      <w:r>
+        <w:t>5. Assess the provider bm fields for one representative feed, preserve lineage, validate the settings format and delivery, then test in-game against agreed category-fidelity tolerances.</w:t>
+      </w:r>
+    </w:p>
+    <w:p>
+      <w:pPr>
+        <w:pStyle w:val="ListBullet"/>
+      </w:pPr>
+      <w:r>
+        <w:t>6. Complete the player-facing explanation-to-practice loop and record acceptance evidence before changing milestone one to COMPLETE. Comparable-category reassessment and automated collection remain later extensions.</w:t>
+      </w:r>
+    </w:p>
+    <w:p>
+      <w:r>
+        <w:t>The separate 20-feed repeatability protocol for key 54334.340 / feed ANLY01 was accepted by the player, but no results have been supplied. Passing that broad usability test would not by itself satisfy the original category-specific fidelity gate.</w:t>
+      </w:r>
+    </w:p>
+    <w:p>
+      <w:pPr>
+        <w:pStyle w:val="Heading2"/>
+      </w:pPr>
+      <w:r>
+        <w:t>16.6 Verification and implementation references</w:t>
+      </w:r>
+    </w:p>
+    <w:p>
+      <w:r>
+        <w:t>Validation completed for the import delivery: 125 Python tests and 46 JavaScript tests passed. Real-file checks verified 181/138/43 records, all 41 fields, both players, exact raw-byte preservation and idempotent reimport. Browser checks covered served/offline filtering, pagination, row inspection, export and a narrow-screen layout. These establish software behaviour and data preservation, not independent provider classification accuracy or in-game physical reproduction.</w:t>
+      </w:r>
+    </w:p>
+    <w:p>
+      <w:r>
+        <w:t>Implementation: hero_import.py; dashboard/hero.js; dashboard.py; analyst.py; serve.py. Documentation: docs/HERO_IMPORT.md; docs/HERO_IMPORT_DEVELOPER_HANDOFF.md; docs/hero-import.example.json. Private archive: output/hero_imports.sqlite3; normalized snapshot: output/hero_evidence.1909208.json. Raw source export and private manifest are intentionally not repository fixtures.</w:t>
+      </w:r>
+    </w:p>
+    <w:p>
+      <w:r>
+        <w:t>Research references: https://11hero.com/upload ; https://11hero.com/players/1909208 ; https://11clubhouse.com/live/ ; https://github.com/Cristy94/eleven-vr-scoreboard . Research observations are dated 25 October 2026 and remain subject to provider changes.</w:t>
+      </w:r>
+    </w:p>
+    <w:p>
+      <w:pPr>
+        <w:pStyle w:val="Heading1"/>
+      </w:pPr>
+      <w:r>
+        <w:t>17 Assisted review and synthetic geometry: milestone one remains PARTIAL</w:t>
+      </w:r>
+    </w:p>
+    <w:p>
+      <w:pPr>
+        <w:pStyle w:val="Heading2"/>
+      </w:pPr>
+      <w:r>
+        <w:t>17.1 Actual sample audit and source boundaries</w:t>
+      </w:r>
+    </w:p>
+    <w:p>
+      <w:r>
+        <w:t>The single imported reference export contains 21 opponent serve Hits. Two are provider-marked unsuccessful serves; 19 have a following target-player Hit in file order, including six marked unsuccessful. All 21 opponent serves have Mid direction and distance labels (18 BottomLeft spin, three TopLeft). These annotations are not validated receiving-attempt or error counts. The provider ace flag can coexist with a return contact and must not be interpreted as a missed contact.</w:t>
+      </w:r>
+    </w:p>
+    <w:p>
+      <w:r>
+        <w:t>Real long/backhand category attempts, errors, match counts and error rate remain unknown, not zero. No replay or video has been supplied. The source score anomaly remains unresolved. Neither provider rows nor local profiles, snapshots, machine settings, publication receipts or loss denominators are changed by the review workflow.</w:t>
+      </w:r>
+    </w:p>
+    <w:p>
+      <w:pPr>
+        <w:pStyle w:val="Heading2"/>
+      </w:pPr>
+      <w:r>
+        <w:t>17.2 Receiver-perspective definitions and validation gates</w:t>
+      </w:r>
+    </w:p>
+    <w:p>
+      <w:pPr>
+        <w:pStyle w:val="ListBullet"/>
+      </w:pPr>
+      <w:r>
+        <w:t>Player 1909208 is user-confirmed right-handed. Backhand side means the receiver's left; for a left-handed player it means the receiver's right. Location does not identify the stroke played.</w:t>
+      </w:r>
+    </w:p>
+    <w:p>
+      <w:pPr>
+        <w:pStyle w:val="ListBullet"/>
+      </w:pPr>
+      <w:r>
+        <w:t>Placement requires a validated coordinate transform into the receiver's frame, validated event timing and validated bounce reconstruction. Do not classify from camera orientation or Hero direction/distance labels. All real placement is unknown until these gates are met.</w:t>
+      </w:r>
+    </w:p>
+    <w:p>
+      <w:pPr>
+        <w:pStyle w:val="ListBullet"/>
+      </w:pPr>
+      <w:r>
+        <w:t>Long requires the hypothetical next table bounce, without a return, to fall beyond the receiver's end line. A deep first bounce alone is insufficient. Boundaries and uncertainty must be explicit.</w:t>
+      </w:r>
+    </w:p>
+    <w:p>
+      <w:pPr>
+        <w:pStyle w:val="ListBullet"/>
+      </w:pPr>
+      <w:r>
+        <w:t>Spin coordinate axes and units remain unvalidated for the provider. Mixed spin must retain its components. No imported vector is substituted into a launcher slider.</w:t>
+      </w:r>
+    </w:p>
+    <w:p>
+      <w:pPr>
+        <w:pStyle w:val="Heading2"/>
+      </w:pPr>
+      <w:r>
+        <w:t>17.3 Implemented assisted review and synthetic checks</w:t>
+      </w:r>
+    </w:p>
+    <w:p>
+      <w:r>
+        <w:t>Hero imports now offers a per-revision opponent-serve review queue, original fields, following recorded Hit, source identity and sequence warnings. Pending notes or reference-backed immediate-return observations are appended to browser-local history. Each record includes player, revision/source hash, match, point, shot, export-row index and timestamp. User observations stay separate from Analyst outcomes; geometry cannot be overridden and keys remain withheld.</w:t>
+      </w:r>
+    </w:p>
+    <w:p>
+      <w:r>
+        <w:t>Review history can be exported as 11analyst.hero-reviews v1. It is not automatically stored in the source archive, carried onto later revisions, synchronized across browser origins, or re-imported. Corrupt/unavailable storage is reported without overwriting it. Export a backup for durable transfer.</w:t>
+      </w:r>
+    </w:p>
+    <w:p>
+      <w:r>
+        <w:t>The geometry prototype accepts synthetic fixtures only: explicitly supplied first/next bounces, frame orientation, handedness and tolerances. It does not reconstruct real trajectories. Tests cover both hands, receiver ends, side changes, translated origins, mixed/pure/zero spin, deep-first-bounce negatives, centre/end-line/edge boundaries and every validation gate. Synthetic tests verify logic, not real-world accuracy. Fixture tolerances are not agreed in-game acceptance tolerances.</w:t>
+      </w:r>
+    </w:p>
+    <w:p>
+      <w:pPr>
+        <w:pStyle w:val="Heading2"/>
+      </w:pPr>
+      <w:r>
+        <w:t>17.4 Remaining acceptance work</w:t>
+      </w:r>
+    </w:p>
+    <w:p>
+      <w:pPr>
+        <w:pStyle w:val="ListBullet"/>
+      </w:pPr>
+      <w:r>
+        <w:t>Obtain an independent reference and validate coordinate axes, receiver transform, event timing, spin units and bounce reconstruction before classifying actual placement.</w:t>
+      </w:r>
+    </w:p>
+    <w:p>
+      <w:pPr>
+        <w:pStyle w:val="ListBullet"/>
+      </w:pPr>
+      <w:r>
+        <w:t>Establish actual long-sidespin/backhand membership and immediate-return outcomes, then report attempts/errors, match coverage, uncertainty and representative examples without combining revisions or double-counting sources.</w:t>
+      </w:r>
+    </w:p>
+    <w:p>
+      <w:pPr>
+        <w:pStyle w:val="ListBullet"/>
+      </w:pPr>
+      <w:r>
+        <w:t>Agree category-specific spin, pace, bounce, placement and length tolerances; validate one representative feed in Eleven and complete the player walkthrough. The generic key 54334.340 and its separate 20-feed repeatability protocol do not establish category fidelity. No new in-game results have been supplied.</w:t>
+      </w:r>
+    </w:p>
+    <w:p>
+      <w:r>
+        <w:t>Implementation references: docs/HERO_IMPORT.md, dashboard/hero_review.js, tests/test_hero_review.js and tests/test_dashboard.py. The original milestone-one acceptance criteria remain unchanged.</w:t>
       </w:r>
     </w:p>
     <w:sectPr>

</xml_diff>